<commit_message>
Extract 산출기준 with the company code table (01-03, 10, 95-98)
Basis rules are now regexes checked in order: MAX(가입금액, 기납입보험료)
or 추가설계 -> 10; 1구좌 -> 95-98 by the premium per unit found near the
table; 기납입/총 납입보험료 -> 03; 월납·연납·일시납·기본보험료·거치 and
plain 보험료 -> 02; 보험가입금액 or a won amount -> 01. Unit-based amounts
are divided by the unit premium for the rate, and the matched wording is
kept in a new 근거_산출기준 column. The search for [기준: …] above a table
no longer reaches past the previous table. Example policy gains a
savings rider and a unit-based rider to show the new codes.

Co-Authored-By: Claude Opus 5.5 <noreply@anthropic.com>
Claude-Session: https://claude.ai/code/session_01BHEdtSnidyfERzeafRkXoB
</commit_message>
<xml_diff>
--- a/web/sample/sample_policy.docx
+++ b/web/sample/sample_policy.docx
@@ -401,6 +401,279 @@
         <w:t>(주) 같은 상해로 두 가지 이상의 후유장해가 생긴 경우에는 각각 합산합니다.</w:t>
       </w:r>
     </w:p>
+    <w:p>
+      <w:r>
+        <w:t>3. 무배당 예제저축특약</w:t>
+      </w:r>
+    </w:p>
+    <w:p>
+      <w:r>
+        <w:t>【별표3】 예제저축특약 보험금 지급기준표</w:t>
+      </w:r>
+    </w:p>
+    <w:tbl>
+      <w:tblPr>
+        <w:tblStyle w:val="TableGrid"/>
+        <w:tblW w:type="auto" w:w="0"/>
+        <w:tblLook w:firstColumn="1" w:firstRow="1" w:lastColumn="0" w:lastRow="0" w:noHBand="0" w:noVBand="1" w:val="04A0"/>
+      </w:tblPr>
+      <w:tblGrid>
+        <w:gridCol w:w="2880"/>
+        <w:gridCol w:w="2880"/>
+        <w:gridCol w:w="2880"/>
+      </w:tblGrid>
+      <w:tr>
+        <w:tc>
+          <w:tcPr>
+            <w:tcW w:type="dxa" w:w="2880"/>
+          </w:tcPr>
+          <w:p>
+            <w:r>
+              <w:t>급부명</w:t>
+            </w:r>
+          </w:p>
+        </w:tc>
+        <w:tc>
+          <w:tcPr>
+            <w:tcW w:type="dxa" w:w="2880"/>
+          </w:tcPr>
+          <w:p>
+            <w:r>
+              <w:t>지급사유</w:t>
+            </w:r>
+          </w:p>
+        </w:tc>
+        <w:tc>
+          <w:tcPr>
+            <w:tcW w:type="dxa" w:w="2880"/>
+          </w:tcPr>
+          <w:p>
+            <w:r>
+              <w:t>지급금액</w:t>
+            </w:r>
+          </w:p>
+        </w:tc>
+      </w:tr>
+      <w:tr>
+        <w:tc>
+          <w:tcPr>
+            <w:tcW w:type="dxa" w:w="2880"/>
+          </w:tcPr>
+          <w:p>
+            <w:r>
+              <w:t>사망보험금 (제3조)</w:t>
+            </w:r>
+          </w:p>
+        </w:tc>
+        <w:tc>
+          <w:tcPr>
+            <w:tcW w:type="dxa" w:w="2880"/>
+          </w:tcPr>
+          <w:p>
+            <w:r>
+              <w:t>보험기간 중 피보험자가 사망하였을 때</w:t>
+            </w:r>
+          </w:p>
+        </w:tc>
+        <w:tc>
+          <w:tcPr>
+            <w:tcW w:type="dxa" w:w="2880"/>
+          </w:tcPr>
+          <w:p>
+            <w:r>
+              <w:t>MAX(보험가입금액, 기납입보험료 합계) × 추가설계 사망보험금 비율</w:t>
+            </w:r>
+          </w:p>
+        </w:tc>
+      </w:tr>
+      <w:tr>
+        <w:tc>
+          <w:tcPr>
+            <w:tcW w:type="dxa" w:w="2880"/>
+          </w:tcPr>
+          <w:p>
+            <w:r>
+              <w:t>만기환급금 (제4조)</w:t>
+            </w:r>
+          </w:p>
+        </w:tc>
+        <w:tc>
+          <w:tcPr>
+            <w:tcW w:type="dxa" w:w="2880"/>
+          </w:tcPr>
+          <w:p>
+            <w:r>
+              <w:t>보험기간이 끝날 때까지 피보험자가 살아 있을 때</w:t>
+            </w:r>
+          </w:p>
+        </w:tc>
+        <w:tc>
+          <w:tcPr>
+            <w:tcW w:type="dxa" w:w="2880"/>
+          </w:tcPr>
+          <w:p>
+            <w:r>
+              <w:t>기납입보험료의 100%</w:t>
+            </w:r>
+          </w:p>
+        </w:tc>
+      </w:tr>
+      <w:tr>
+        <w:tc>
+          <w:tcPr>
+            <w:tcW w:type="dxa" w:w="2880"/>
+          </w:tcPr>
+          <w:p>
+            <w:r>
+              <w:t>중도급부금 (제5조)</w:t>
+            </w:r>
+          </w:p>
+        </w:tc>
+        <w:tc>
+          <w:tcPr>
+            <w:tcW w:type="dxa" w:w="2880"/>
+          </w:tcPr>
+          <w:p>
+            <w:r>
+              <w:t>계약일부터 10년 경과시점에 피보험자가 살아 있을 때</w:t>
+            </w:r>
+          </w:p>
+        </w:tc>
+        <w:tc>
+          <w:tcPr>
+            <w:tcW w:type="dxa" w:w="2880"/>
+          </w:tcPr>
+          <w:p>
+            <w:r>
+              <w:t>[월납] 월납보험료의 50%</w:t>
+            </w:r>
+          </w:p>
+        </w:tc>
+      </w:tr>
+    </w:tbl>
+    <w:p>
+      <w:r>
+        <w:t>4. 무배당 예제구좌형특약</w:t>
+      </w:r>
+    </w:p>
+    <w:p>
+      <w:r>
+        <w:t>【별표4】 예제구좌형특약 보험금 지급기준표</w:t>
+      </w:r>
+    </w:p>
+    <w:p>
+      <w:r>
+        <w:t>[기준: 1구좌 = 보험료 1,000만원]</w:t>
+      </w:r>
+    </w:p>
+    <w:tbl>
+      <w:tblPr>
+        <w:tblStyle w:val="TableGrid"/>
+        <w:tblW w:type="auto" w:w="0"/>
+        <w:tblLook w:firstColumn="1" w:firstRow="1" w:lastColumn="0" w:lastRow="0" w:noHBand="0" w:noVBand="1" w:val="04A0"/>
+      </w:tblPr>
+      <w:tblGrid>
+        <w:gridCol w:w="2880"/>
+        <w:gridCol w:w="2880"/>
+        <w:gridCol w:w="2880"/>
+      </w:tblGrid>
+      <w:tr>
+        <w:tc>
+          <w:tcPr>
+            <w:tcW w:type="dxa" w:w="2880"/>
+          </w:tcPr>
+          <w:p>
+            <w:r>
+              <w:t>급부명</w:t>
+            </w:r>
+          </w:p>
+        </w:tc>
+        <w:tc>
+          <w:tcPr>
+            <w:tcW w:type="dxa" w:w="2880"/>
+          </w:tcPr>
+          <w:p>
+            <w:r>
+              <w:t>지급사유</w:t>
+            </w:r>
+          </w:p>
+        </w:tc>
+        <w:tc>
+          <w:tcPr>
+            <w:tcW w:type="dxa" w:w="2880"/>
+          </w:tcPr>
+          <w:p>
+            <w:r>
+              <w:t>지급금액</w:t>
+            </w:r>
+          </w:p>
+        </w:tc>
+      </w:tr>
+      <w:tr>
+        <w:tc>
+          <w:tcPr>
+            <w:tcW w:type="dxa" w:w="2880"/>
+          </w:tcPr>
+          <w:p>
+            <w:r>
+              <w:t>질병입원일당 (제3조)</w:t>
+            </w:r>
+          </w:p>
+        </w:tc>
+        <w:tc>
+          <w:tcPr>
+            <w:tcW w:type="dxa" w:w="2880"/>
+          </w:tcPr>
+          <w:p>
+            <w:r>
+              <w:t>질병으로 4일 이상 계속 입원하였을 때 (3일 초과 1일당)</w:t>
+            </w:r>
+          </w:p>
+        </w:tc>
+        <w:tc>
+          <w:tcPr>
+            <w:tcW w:type="dxa" w:w="2880"/>
+          </w:tcPr>
+          <w:p>
+            <w:r>
+              <w:t>1구좌당 2만원</w:t>
+            </w:r>
+          </w:p>
+        </w:tc>
+      </w:tr>
+      <w:tr>
+        <w:tc>
+          <w:tcPr>
+            <w:tcW w:type="dxa" w:w="2880"/>
+          </w:tcPr>
+          <w:p>
+            <w:r>
+              <w:t>질병수술비 (제4조)</w:t>
+            </w:r>
+          </w:p>
+        </w:tc>
+        <w:tc>
+          <w:tcPr>
+            <w:tcW w:type="dxa" w:w="2880"/>
+          </w:tcPr>
+          <w:p>
+            <w:r>
+              <w:t>질병으로 수술을 받았을 때 (수술 1회당)</w:t>
+            </w:r>
+          </w:p>
+        </w:tc>
+        <w:tc>
+          <w:tcPr>
+            <w:tcW w:type="dxa" w:w="2880"/>
+          </w:tcPr>
+          <w:p>
+            <w:r>
+              <w:t>1구좌당 50만원</w:t>
+            </w:r>
+          </w:p>
+        </w:tc>
+      </w:tr>
+    </w:tbl>
     <w:sectPr>
       <w:pgSz w:w="12240" w:h="15840"/>
       <w:pgMar w:top="1440" w:right="1800" w:bottom="1440" w:left="1800" w:header="720" w:footer="720" w:gutter="0"/>

</xml_diff>

<commit_message>
Replace 납입주기 with 지급주기 (100 / 211) in the draft table
The draft column was the premium payment cycle; the statistics table
needs the benefit payment cycle (PAY_TERM1). get_pay_term() returns 211
when the reason/amount describes a fixed number of monthly payments
(매월 … n회, n회 월지급, n개월간 매월) and 100 otherwise. The column sits
after 지급율 like PAY_RATE1/PAY_TERM1; 납입주기 stays in 급부원문 for
reference and the matched wording goes to 근거_지급주기. Examples and
the info tab follow.

Co-Authored-By: Claude Opus 5.5 <noreply@anthropic.com>
Claude-Session: https://claude.ai/code/session_01BHEdtSnidyfERzeafRkXoB
</commit_message>
<xml_diff>
--- a/web/sample/sample_policy.docx
+++ b/web/sample/sample_policy.docx
@@ -550,6 +550,38 @@
           </w:p>
         </w:tc>
       </w:tr>
+      <w:tr>
+        <w:tc>
+          <w:tcPr>
+            <w:tcW w:type="dxa" w:w="2880"/>
+          </w:tcPr>
+          <w:p>
+            <w:r>
+              <w:t>생활자금 (제6조)</w:t>
+            </w:r>
+          </w:p>
+        </w:tc>
+        <w:tc>
+          <w:tcPr>
+            <w:tcW w:type="dxa" w:w="2880"/>
+          </w:tcPr>
+          <w:p>
+            <w:r>
+              <w:t>계약일부터 10년 경과시점부터 매월 계약해당일에 피보험자가 살아 있을 때 (120회 한도)</w:t>
+            </w:r>
+          </w:p>
+        </w:tc>
+        <w:tc>
+          <w:tcPr>
+            <w:tcW w:type="dxa" w:w="2880"/>
+          </w:tcPr>
+          <w:p>
+            <w:r>
+              <w:t>보험가입금액의 1%</w:t>
+            </w:r>
+          </w:p>
+        </w:tc>
+      </w:tr>
     </w:tbl>
     <w:p>
       <w:r>

</xml_diff>